<commit_message>
Release prep: version bump, changelog, updated user guide
- Version bump (app and installer) and CHANGELOG.md
- User guide (.docx): version numbers, the passages that changed, and a
  What's-new section

Co-Authored-By: Claude Opus 5.5 <noreply@anthropic.com>
Claude-Session: https://claude.ai/code/session_01AVPCuM1vrgCwJ6Z7LiJ62s
</commit_message>
<xml_diff>
--- a/AeroLab_Studio_User_Guide.docx
+++ b/AeroLab_Studio_User_Guide.docx
@@ -31,7 +31,7 @@
           <w:b/>
           <w:sz w:val="26"/>
         </w:rPr>
-        <w:t>User guide  ·  version 1.0.0</w:t>
+        <w:t>User guide  ·  version 1.1.0</w:t>
       </w:r>
     </w:p>
     <w:p/>
@@ -448,7 +448,7 @@
           <w:rFonts w:ascii="Consolas" w:hAnsi="Consolas"/>
           <w:sz w:val="19"/>
         </w:rPr>
-        <w:t>dist\AeroLabStudio-Setup-1.0.0.exe</w:t>
+        <w:t>dist\AeroLabStudio-Setup-1.1.0.exe</w:t>
       </w:r>
       <w:r>
         <w:t xml:space="preserve"> and follow the wizard (it creates a Start-menu shortcut and, if you tick it, a desktop shortcut; it can be removed from Windows Settings › Apps).</w:t>
@@ -487,7 +487,7 @@
           <w:rFonts w:ascii="Consolas" w:hAnsi="Consolas"/>
           <w:sz w:val="19"/>
         </w:rPr>
-        <w:t>dist\AeroLabStudio-1.0.0-portable.zip</w:t>
+        <w:t>dist\AeroLabStudio-1.1.0-portable.zip</w:t>
       </w:r>
       <w:r>
         <w:t xml:space="preserve"> anywhere and run </w:t>
@@ -1704,7 +1704,7 @@
         <w:t>Analyse all imported</w:t>
       </w:r>
       <w:r>
-        <w:t xml:space="preserve"> guesses for every dataset, runs the confident ones and reports how many succeeded.</w:t>
+        <w:t xml:space="preserve"> runs only the datasets whose measurement and columns are clearly named, and lists the rest for you to map by hand. A column picked only by its position is marked “guessed — check”.</w:t>
       </w:r>
     </w:p>
     <w:p>
@@ -2607,7 +2607,7 @@
         <w:t>±</w:t>
       </w:r>
       <w:r>
-        <w:t xml:space="preserve"> box beside an input is optional. Fill in one or more and the result carries a propagated uncertainty (central differences, no linearity assumption).</w:t>
+        <w:t xml:space="preserve"> box beside an input is optional. Fill in one or more and the result carries a propagated uncertainty: first-order (linearised) propagation that treats the inputs as independent. Where it cannot be evaluated the result says so instead of showing ± 0. Kept results keep their uncertainty and it is exported.</w:t>
       </w:r>
     </w:p>
     <w:p>
@@ -3273,7 +3273,7 @@
         <w:t>reproduced</w:t>
       </w:r>
       <w:r>
-        <w:t xml:space="preserve"> — the equation returns the published value within tolerance.</w:t>
+        <w:t xml:space="preserve"> — the equation returns the reference value within tolerance. The Basis column says whether that reference is a value printed in a paper, a physics check, or our own recomputation.</w:t>
       </w:r>
     </w:p>
     <w:p>
@@ -3356,7 +3356,7 @@
           <w:color w:val="6A7280"/>
           <w:sz w:val="18"/>
         </w:rPr>
-        <w:t>Figure 7. Validation: every case, its published and computed value, and its status.</w:t>
+        <w:t>Figure 7. Validation: every case with its computed and reference value, what the paper prints, and its status.</w:t>
       </w:r>
     </w:p>
     <w:p>
@@ -4156,8 +4156,138 @@
         <w:t>Figure 8. The About page.</w:t>
       </w:r>
     </w:p>
+    <w:p>
+      <w:pPr>
+        <w:pStyle w:val="Heading1"/>
+      </w:pPr>
+      <w:r>
+        <w:t>What's new in version 1.1.0</w:t>
+      </w:r>
+    </w:p>
+    <w:p>
+      <w:r>
+        <w:t>Changes after an independent science and usability review; docs/REVIEW_LOG.md lists every finding and what was done.</w:t>
+      </w:r>
+    </w:p>
+    <w:p>
+      <w:pPr>
+        <w:pStyle w:val="ListBullet"/>
+      </w:pPr>
+      <w:r>
+        <w:rPr>
+          <w:b/>
+        </w:rPr>
+        <w:t>Units on import</w:t>
+      </w:r>
+      <w:r>
+        <w:t xml:space="preserve"> — columns are converted to the unit each analysis needs (kPa → MPa, K → °C, mm/mm → %); a column of the wrong kind, such as a force in N mapped to stress, is refused.</w:t>
+      </w:r>
+    </w:p>
+    <w:p>
+      <w:pPr>
+        <w:pStyle w:val="ListBullet"/>
+      </w:pPr>
+      <w:r>
+        <w:rPr>
+          <w:b/>
+        </w:rPr>
+        <w:t>Fatigue</w:t>
+      </w:r>
+      <w:r>
+        <w:t xml:space="preserve"> — S–N and strain–life fits regress life on stress or strain (ASTM E739), give standard errors and 95 % intervals, and are plotted against reversals 2N.</w:t>
+      </w:r>
+    </w:p>
+    <w:p>
+      <w:pPr>
+        <w:pStyle w:val="ListBullet"/>
+      </w:pPr>
+      <w:r>
+        <w:rPr>
+          <w:b/>
+        </w:rPr>
+        <w:t>Stress–strain</w:t>
+      </w:r>
+      <w:r>
+        <w:t xml:space="preserve"> — the modulus window must span at least 0.5 % strain; elongation at break is taken before the stress falls below 10 % of the UTS; offset yield can be switched off.</w:t>
+      </w:r>
+    </w:p>
+    <w:p>
+      <w:pPr>
+        <w:pStyle w:val="ListBullet"/>
+      </w:pPr>
+      <w:r>
+        <w:rPr>
+          <w:b/>
+        </w:rPr>
+        <w:t>DSC, BET, TGA</w:t>
+      </w:r>
+      <w:r>
+        <w:t xml:space="preserve"> — the option is now “Endotherms point up”; mW data can be normalised by the sample mass; BET uses the adsorption branch only and checks the Rouquerol criteria; TGA has a dry-basis option.</w:t>
+      </w:r>
+    </w:p>
+    <w:p>
+      <w:pPr>
+        <w:pStyle w:val="ListBullet"/>
+      </w:pPr>
+      <w:r>
+        <w:rPr>
+          <w:b/>
+        </w:rPr>
+        <w:t>Graphs</w:t>
+      </w:r>
+      <w:r>
+        <w:t xml:space="preserve"> — the range an analysis used is shaded: the modulus window, the BET range and the DSC integration limits.</w:t>
+      </w:r>
+    </w:p>
+    <w:p>
+      <w:pPr>
+        <w:pStyle w:val="ListBullet"/>
+      </w:pPr>
+      <w:r>
+        <w:rPr>
+          <w:b/>
+        </w:rPr>
+        <w:t>Settings</w:t>
+      </w:r>
+      <w:r>
+        <w:t xml:space="preserve"> — the Settings tab shows the values a run actually used, and warns when they have been changed but not yet re-run.</w:t>
+      </w:r>
+    </w:p>
+    <w:p>
+      <w:pPr>
+        <w:pStyle w:val="ListBullet"/>
+      </w:pPr>
+      <w:r>
+        <w:rPr>
+          <w:b/>
+        </w:rPr>
+        <w:t>Exports</w:t>
+      </w:r>
+      <w:r>
+        <w:t xml:space="preserve"> — long curves are charted whole in Excel; the provenance sheet records the version, the column mapping and a fingerprint (SHA-256) of each source file.</w:t>
+      </w:r>
+    </w:p>
+    <w:p>
+      <w:pPr>
+        <w:pStyle w:val="ListBullet"/>
+      </w:pPr>
+      <w:r>
+        <w:rPr>
+          <w:b/>
+        </w:rPr>
+        <w:t>Window</w:t>
+      </w:r>
+      <w:r>
+        <w:t xml:space="preserve"> — pages scroll on small screens (minimum 960 × 600) and the dark theme meets the WCAG AA contrast level for text.</w:t>
+      </w:r>
+    </w:p>
     <w:sectPr>
       <w:footerReference w:type="default" r:id="rId17"/>
+      <w:headerReference w:type="default" r:id="rId18"/>
+      <w:headerReference w:type="first" r:id="rId19"/>
+      <w:footerReference w:type="first" r:id="rId20"/>
+      <w:headerReference w:type="even" r:id="rId21"/>
+      <w:footerReference w:type="even" r:id="rId22"/>
       <w:pgSz w:w="12240" w:h="15840"/>
       <w:pgMar w:top="1134" w:right="1247" w:bottom="1020" w:left="1247" w:header="720" w:footer="720" w:gutter="0"/>
       <w:cols w:space="720"/>
@@ -4179,7 +4309,7 @@
         <w:color w:val="6A7280"/>
         <w:sz w:val="17"/>
       </w:rPr>
-      <w:t xml:space="preserve">AeroLab Studio 1.0.0 — user guide   ·   page </w:t>
+      <w:t xml:space="preserve">AeroLab Studio 1.1.0 — user guide   ·   page </w:t>
     </w:r>
     <w:r>
       <w:rPr>
@@ -4204,6 +4334,56 @@
     </w:r>
   </w:p>
 </w:ftr>
+</file>
+
+<file path=word/footer2.xml><?xml version="1.0" encoding="utf-8"?>
+<w:ftr xmlns:m="http://schemas.openxmlformats.org/officeDocument/2006/math" xmlns:mc="http://schemas.openxmlformats.org/markup-compatibility/2006" xmlns:mo="http://schemas.microsoft.com/office/mac/office/2008/main" xmlns:mv="urn:schemas-microsoft-com:mac:vml" xmlns:o="urn:schemas-microsoft-com:office:office" xmlns:r="http://schemas.openxmlformats.org/officeDocument/2006/relationships" xmlns:v="urn:schemas-microsoft-com:vml" xmlns:w10="urn:schemas-microsoft-com:office:word" xmlns:w14="http://schemas.microsoft.com/office/word/2010/wordml" xmlns:w="http://schemas.openxmlformats.org/wordprocessingml/2006/main" xmlns:wne="http://schemas.microsoft.com/office/word/2006/wordml" xmlns:wp14="http://schemas.microsoft.com/office/word/2010/wordprocessingDrawing" xmlns:wp="http://schemas.openxmlformats.org/drawingml/2006/wordprocessingDrawing" xmlns:wpc="http://schemas.microsoft.com/office/word/2010/wordprocessingCanvas" xmlns:wpg="http://schemas.microsoft.com/office/word/2010/wordprocessingGroup" xmlns:wpi="http://schemas.microsoft.com/office/word/2010/wordprocessingInk" xmlns:wps="http://schemas.microsoft.com/office/word/2010/wordprocessingShape" mc:Ignorable="w14 wp14">
+  <w:p>
+    <w:pPr>
+      <w:pStyle w:val="Footer"/>
+    </w:pPr>
+  </w:p>
+</w:ftr>
+</file>
+
+<file path=word/footer3.xml><?xml version="1.0" encoding="utf-8"?>
+<w:ftr xmlns:m="http://schemas.openxmlformats.org/officeDocument/2006/math" xmlns:mc="http://schemas.openxmlformats.org/markup-compatibility/2006" xmlns:mo="http://schemas.microsoft.com/office/mac/office/2008/main" xmlns:mv="urn:schemas-microsoft-com:mac:vml" xmlns:o="urn:schemas-microsoft-com:office:office" xmlns:r="http://schemas.openxmlformats.org/officeDocument/2006/relationships" xmlns:v="urn:schemas-microsoft-com:vml" xmlns:w10="urn:schemas-microsoft-com:office:word" xmlns:w14="http://schemas.microsoft.com/office/word/2010/wordml" xmlns:w="http://schemas.openxmlformats.org/wordprocessingml/2006/main" xmlns:wne="http://schemas.microsoft.com/office/word/2006/wordml" xmlns:wp14="http://schemas.microsoft.com/office/word/2010/wordprocessingDrawing" xmlns:wp="http://schemas.openxmlformats.org/drawingml/2006/wordprocessingDrawing" xmlns:wpc="http://schemas.microsoft.com/office/word/2010/wordprocessingCanvas" xmlns:wpg="http://schemas.microsoft.com/office/word/2010/wordprocessingGroup" xmlns:wpi="http://schemas.microsoft.com/office/word/2010/wordprocessingInk" xmlns:wps="http://schemas.microsoft.com/office/word/2010/wordprocessingShape" mc:Ignorable="w14 wp14">
+  <w:p>
+    <w:pPr>
+      <w:pStyle w:val="Footer"/>
+    </w:pPr>
+  </w:p>
+</w:ftr>
+</file>
+
+<file path=word/header1.xml><?xml version="1.0" encoding="utf-8"?>
+<w:hdr xmlns:m="http://schemas.openxmlformats.org/officeDocument/2006/math" xmlns:mc="http://schemas.openxmlformats.org/markup-compatibility/2006" xmlns:mo="http://schemas.microsoft.com/office/mac/office/2008/main" xmlns:mv="urn:schemas-microsoft-com:mac:vml" xmlns:o="urn:schemas-microsoft-com:office:office" xmlns:r="http://schemas.openxmlformats.org/officeDocument/2006/relationships" xmlns:v="urn:schemas-microsoft-com:vml" xmlns:w10="urn:schemas-microsoft-com:office:word" xmlns:w14="http://schemas.microsoft.com/office/word/2010/wordml" xmlns:w="http://schemas.openxmlformats.org/wordprocessingml/2006/main" xmlns:wne="http://schemas.microsoft.com/office/word/2006/wordml" xmlns:wp14="http://schemas.microsoft.com/office/word/2010/wordprocessingDrawing" xmlns:wp="http://schemas.openxmlformats.org/drawingml/2006/wordprocessingDrawing" xmlns:wpc="http://schemas.microsoft.com/office/word/2010/wordprocessingCanvas" xmlns:wpg="http://schemas.microsoft.com/office/word/2010/wordprocessingGroup" xmlns:wpi="http://schemas.microsoft.com/office/word/2010/wordprocessingInk" xmlns:wps="http://schemas.microsoft.com/office/word/2010/wordprocessingShape" mc:Ignorable="w14 wp14">
+  <w:p>
+    <w:pPr>
+      <w:pStyle w:val="Header"/>
+    </w:pPr>
+  </w:p>
+</w:hdr>
+</file>
+
+<file path=word/header2.xml><?xml version="1.0" encoding="utf-8"?>
+<w:hdr xmlns:m="http://schemas.openxmlformats.org/officeDocument/2006/math" xmlns:mc="http://schemas.openxmlformats.org/markup-compatibility/2006" xmlns:mo="http://schemas.microsoft.com/office/mac/office/2008/main" xmlns:mv="urn:schemas-microsoft-com:mac:vml" xmlns:o="urn:schemas-microsoft-com:office:office" xmlns:r="http://schemas.openxmlformats.org/officeDocument/2006/relationships" xmlns:v="urn:schemas-microsoft-com:vml" xmlns:w10="urn:schemas-microsoft-com:office:word" xmlns:w14="http://schemas.microsoft.com/office/word/2010/wordml" xmlns:w="http://schemas.openxmlformats.org/wordprocessingml/2006/main" xmlns:wne="http://schemas.microsoft.com/office/word/2006/wordml" xmlns:wp14="http://schemas.microsoft.com/office/word/2010/wordprocessingDrawing" xmlns:wp="http://schemas.openxmlformats.org/drawingml/2006/wordprocessingDrawing" xmlns:wpc="http://schemas.microsoft.com/office/word/2010/wordprocessingCanvas" xmlns:wpg="http://schemas.microsoft.com/office/word/2010/wordprocessingGroup" xmlns:wpi="http://schemas.microsoft.com/office/word/2010/wordprocessingInk" xmlns:wps="http://schemas.microsoft.com/office/word/2010/wordprocessingShape" mc:Ignorable="w14 wp14">
+  <w:p>
+    <w:pPr>
+      <w:pStyle w:val="Header"/>
+    </w:pPr>
+  </w:p>
+</w:hdr>
+</file>
+
+<file path=word/header3.xml><?xml version="1.0" encoding="utf-8"?>
+<w:hdr xmlns:m="http://schemas.openxmlformats.org/officeDocument/2006/math" xmlns:mc="http://schemas.openxmlformats.org/markup-compatibility/2006" xmlns:mo="http://schemas.microsoft.com/office/mac/office/2008/main" xmlns:mv="urn:schemas-microsoft-com:mac:vml" xmlns:o="urn:schemas-microsoft-com:office:office" xmlns:r="http://schemas.openxmlformats.org/officeDocument/2006/relationships" xmlns:v="urn:schemas-microsoft-com:vml" xmlns:w10="urn:schemas-microsoft-com:office:word" xmlns:w14="http://schemas.microsoft.com/office/word/2010/wordml" xmlns:w="http://schemas.openxmlformats.org/wordprocessingml/2006/main" xmlns:wne="http://schemas.microsoft.com/office/word/2006/wordml" xmlns:wp14="http://schemas.microsoft.com/office/word/2010/wordprocessingDrawing" xmlns:wp="http://schemas.openxmlformats.org/drawingml/2006/wordprocessingDrawing" xmlns:wpc="http://schemas.microsoft.com/office/word/2010/wordprocessingCanvas" xmlns:wpg="http://schemas.microsoft.com/office/word/2010/wordprocessingGroup" xmlns:wpi="http://schemas.microsoft.com/office/word/2010/wordprocessingInk" xmlns:wps="http://schemas.microsoft.com/office/word/2010/wordprocessingShape" mc:Ignorable="w14 wp14">
+  <w:p>
+    <w:pPr>
+      <w:pStyle w:val="Header"/>
+    </w:pPr>
+  </w:p>
+</w:hdr>
 </file>
 
 <file path=word/numbering.xml><?xml version="1.0" encoding="utf-8"?>

</xml_diff>